<commit_message>
added songs to gustav holst's page, simplified CSS, changed some redundancies
</commit_message>
<xml_diff>
--- a/to_submit.docx
+++ b/to_submit.docx
@@ -1,78 +1,75 @@
 
 <file path=word/document.xml><?xml version="1.0" encoding="utf-8"?>
-<w:document xmlns:wpc="http://schemas.microsoft.com/office/word/2010/wordprocessingCanvas" xmlns:mc="http://schemas.openxmlformats.org/markup-compatibility/2006" xmlns:o="urn:schemas-microsoft-com:office:office" xmlns:r="http://schemas.openxmlformats.org/officeDocument/2006/relationships" xmlns:m="http://schemas.openxmlformats.org/officeDocument/2006/math" xmlns:v="urn:schemas-microsoft-com:vml" xmlns:wp14="http://schemas.microsoft.com/office/word/2010/wordprocessingDrawing" xmlns:wp="http://schemas.openxmlformats.org/drawingml/2006/wordprocessingDrawing" xmlns:w10="urn:schemas-microsoft-com:office:word" xmlns:w="http://schemas.openxmlformats.org/wordprocessingml/2006/main" xmlns:w14="http://schemas.microsoft.com/office/word/2010/wordml" xmlns:w15="http://schemas.microsoft.com/office/word/2012/wordml" xmlns:wpg="http://schemas.microsoft.com/office/word/2010/wordprocessingGroup" xmlns:wpi="http://schemas.microsoft.com/office/word/2010/wordprocessingInk" xmlns:wne="http://schemas.microsoft.com/office/word/2006/wordml" xmlns:wps="http://schemas.microsoft.com/office/word/2010/wordprocessingShape" xmlns:w16se="http://schemas.microsoft.com/office/word/2015/wordml/symex" xmlns:w16cid="http://schemas.microsoft.com/office/word/2016/wordml/cid" xmlns:w16="http://schemas.microsoft.com/office/word/2018/wordml" xmlns:w16cex="http://schemas.microsoft.com/office/word/2018/wordml/cex" xmlns:w16sdtdh="http://schemas.microsoft.com/office/word/2020/wordml/sdtdatahash" xmlns:w16sdtfl="http://schemas.microsoft.com/office/word/2024/wordml/sdtformatlock" xmlns:a="http://schemas.openxmlformats.org/drawingml/2006/main" xmlns:pic="http://schemas.openxmlformats.org/drawingml/2006/picture" xmlns:a14="http://schemas.microsoft.com/office/drawing/2010/main" mc:Ignorable="w14 w15 wp14 w16se w16cid w16 w16cex w16sdtdh w16sdtfl">
+<w:document xmlns:o="urn:schemas-microsoft-com:office:office" xmlns:r="http://schemas.openxmlformats.org/officeDocument/2006/relationships" xmlns:v="urn:schemas-microsoft-com:vml" xmlns:w="http://schemas.openxmlformats.org/wordprocessingml/2006/main" xmlns:w10="urn:schemas-microsoft-com:office:word" xmlns:wp="http://schemas.openxmlformats.org/drawingml/2006/wordprocessingDrawing" xmlns:pic="http://schemas.openxmlformats.org/drawingml/2006/picture" xmlns:wps="http://schemas.microsoft.com/office/word/2010/wordprocessingShape" xmlns:wpg="http://schemas.microsoft.com/office/word/2010/wordprocessingGroup" xmlns:mc="http://schemas.openxmlformats.org/markup-compatibility/2006" xmlns:wp14="http://schemas.microsoft.com/office/word/2010/wordprocessingDrawing" xmlns:w14="http://schemas.microsoft.com/office/word/2010/wordml" xmlns:w15="http://schemas.microsoft.com/office/word/2012/wordml" xmlns:a="http://schemas.openxmlformats.org/drawingml/2006/main" xmlns:a14="http://schemas.microsoft.com/office/drawing/2010/main" mc:Ignorable="w14 wp14 w15">
   <w:body>
-    <w:p xmlns:wp14="http://schemas.microsoft.com/office/word/2010/wordml" wp14:paraId="5685F527" wp14:textId="2D81F3F3">
-      <w:pPr>
-        <w:pStyle w:val="Normal"/>
+    <w:p xmlns:wp14="http://schemas.microsoft.com/office/word/2010/wordml" wp14:textId="77777777">
+      <w:pPr>
+        <w:pStyle w:val="Normal"/>
+        <w:rPr/>
       </w:pPr>
       <w:r>
         <w:rPr/>
         <w:t xml:space="preserve">The URL of our site would be </w:t>
       </w:r>
-      <w:r>
-        <w:fldChar w:fldCharType="begin"/>
-      </w:r>
-      <w:r>
-        <w:instrText xml:space="preserve">HYPERLINK "https://hallamDomain/~followedByUsername/landingPage/earth.html" </w:instrText>
-      </w:r>
-      <w:r>
-        <w:fldChar w:fldCharType="separate"/>
-      </w:r>
-      <w:r>
-        <w:rPr/>
-        <w:t>https://hallamDomain/~followedByUsername/landingPage/earth.html</w:t>
-      </w:r>
-      <w:r>
-        <w:fldChar w:fldCharType="end"/>
-      </w:r>
-    </w:p>
-    <w:p xmlns:wp14="http://schemas.microsoft.com/office/word/2010/wordml" wp14:paraId="1C795109" wp14:textId="396E5982">
-      <w:pPr>
-        <w:pStyle w:val="Normal"/>
+      <w:hyperlink r:id="rId2">
+        <w:r>
+          <w:rPr>
+            <w:rStyle w:val="Style9"/>
+          </w:rPr>
+          <w:t>https://hallamDomain/~followedByUsername/</w:t>
+        </w:r>
+        <w:r>
+          <w:rPr>
+            <w:rStyle w:val="Style9"/>
+          </w:rPr>
+          <w:t>Shay/web-src</w:t>
+        </w:r>
+        <w:r>
+          <w:rPr>
+            <w:rStyle w:val="Style9"/>
+          </w:rPr>
+          <w:t>/earth.html</w:t>
+        </w:r>
+      </w:hyperlink>
+    </w:p>
+    <w:p xmlns:wp14="http://schemas.microsoft.com/office/word/2010/wordml" wp14:textId="77777777">
+      <w:pPr>
+        <w:pStyle w:val="Normal"/>
+        <w:rPr/>
       </w:pPr>
       <w:r>
         <w:rPr>
-          <w:b w:val="1"/>
-          <w:bCs w:val="1"/>
+          <w:b/>
+          <w:bCs/>
           <w:sz w:val="28"/>
           <w:szCs w:val="28"/>
         </w:rPr>
-        <w:t xml:space="preserve">Iso Safi, Shayam </w:t>
-      </w:r>
-      <w:r>
+        <w:t>Iso Safi, Shayam Suhansa, Lavyansh Rathod</w:t>
+      </w:r>
+    </w:p>
+    <w:p xmlns:wp14="http://schemas.microsoft.com/office/word/2010/wordml" wp14:textId="77777777">
+      <w:pPr>
+        <w:pStyle w:val="Normal"/>
         <w:rPr>
-          <w:b w:val="1"/>
-          <w:bCs w:val="1"/>
+          <w:b/>
+          <w:bCs/>
           <w:sz w:val="28"/>
           <w:szCs w:val="28"/>
         </w:rPr>
-        <w:t>Suhansa</w:t>
-      </w:r>
+      </w:pPr>
       <w:r>
         <w:rPr>
-          <w:b w:val="1"/>
-          <w:bCs w:val="1"/>
+          <w:b/>
+          <w:bCs/>
           <w:sz w:val="28"/>
           <w:szCs w:val="28"/>
         </w:rPr>
-        <w:t>, Lavyansh Rathod</w:t>
-      </w:r>
-    </w:p>
-    <w:p xmlns:wp14="http://schemas.microsoft.com/office/word/2010/wordml" wp14:paraId="3AFDA525" wp14:textId="1CFA9217">
-      <w:pPr>
-        <w:pStyle w:val="Normal"/>
-        <w:rPr>
-          <w:b w:val="1"/>
-          <w:bCs w:val="1"/>
-          <w:sz w:val="28"/>
-          <w:szCs w:val="28"/>
-        </w:rPr>
-      </w:pPr>
-    </w:p>
-    <w:p xmlns:wp14="http://schemas.microsoft.com/office/word/2010/wordml" wp14:paraId="14A584D9" wp14:textId="19A22510">
-      <w:pPr>
-        <w:pStyle w:val="Normal"/>
+      </w:r>
+    </w:p>
+    <w:p xmlns:wp14="http://schemas.microsoft.com/office/word/2010/wordml" wp14:textId="77777777">
+      <w:pPr>
+        <w:pStyle w:val="Normal"/>
+        <w:rPr/>
       </w:pPr>
       <w:r>
         <w:rPr/>
@@ -83,255 +80,166 @@
         <w:t>Iso Safi:</w:t>
       </w:r>
     </w:p>
-    <w:p xmlns:wp14="http://schemas.microsoft.com/office/word/2010/wordml" wp14:paraId="75249ECF" wp14:textId="1B459AD3">
-      <w:pPr>
-        <w:pStyle w:val="Normal"/>
-      </w:pPr>
-      <w:r>
-        <w:rPr/>
-        <w:t xml:space="preserve">My main contribution is the detailed Stars and constellations, </w:t>
-      </w:r>
-      <w:r>
-        <w:rPr/>
-        <w:t>Earth</w:t>
-      </w:r>
-      <w:r>
-        <w:rPr/>
-        <w:t xml:space="preserve"> and Moon pages, which all involve some form of rendering, using both D3-celestial and </w:t>
-      </w:r>
-      <w:r>
-        <w:rPr/>
-        <w:t>globegl</w:t>
-      </w:r>
-      <w:r>
-        <w:rPr/>
-        <w:t xml:space="preserve">. </w:t>
-      </w:r>
-      <w:r>
-        <w:rPr/>
-        <w:t>Multiple interactive components, and a number of external links.</w:t>
-      </w:r>
-      <w:r>
-        <w:rPr/>
-        <w:t xml:space="preserve"> I </w:t>
-      </w:r>
-      <w:r>
-        <w:rPr/>
-        <w:t>vendored</w:t>
-      </w:r>
-      <w:r>
-        <w:rPr/>
-        <w:t xml:space="preserve"> every library that I used, and all assets, so nothing is being fetched over the internet (so that I had no </w:t>
-      </w:r>
-      <w:r>
-        <w:rPr/>
-        <w:t>dependencies</w:t>
-      </w:r>
-      <w:r>
-        <w:rPr/>
-        <w:t>).</w:t>
-      </w:r>
-    </w:p>
-    <w:p xmlns:wp14="http://schemas.microsoft.com/office/word/2010/wordml" wp14:paraId="71370B78" wp14:textId="39377BEA">
-      <w:pPr>
-        <w:pStyle w:val="Normal"/>
-      </w:pPr>
-      <w:r>
-        <w:rPr/>
-        <w:t>A much more extensive documentation that I used for my own benefit throughout the project can be found in the celestial-main/web-</w:t>
-      </w:r>
-      <w:r>
-        <w:rPr/>
-        <w:t>src</w:t>
-      </w:r>
-      <w:r>
-        <w:rPr/>
-        <w:t>/</w:t>
-      </w:r>
-      <w:r>
-        <w:rPr/>
-        <w:t>nts</w:t>
-      </w:r>
-      <w:r>
-        <w:rPr/>
-        <w:t xml:space="preserve"> directory.</w:t>
-      </w:r>
-    </w:p>
-    <w:p xmlns:wp14="http://schemas.microsoft.com/office/word/2010/wordml" wp14:paraId="3814C2DD" wp14:textId="17C0F6F7">
-      <w:pPr>
-        <w:pStyle w:val="Normal"/>
+    <w:p xmlns:wp14="http://schemas.microsoft.com/office/word/2010/wordml" wp14:textId="77777777">
+      <w:pPr>
+        <w:pStyle w:val="Normal"/>
+        <w:rPr/>
+      </w:pPr>
+      <w:r>
+        <w:rPr/>
+        <w:t>My main contribution is the detailed Stars and constellations, Earth and Moon pages, which all involve some form of rendering, using both D3-celestial and globegl. Multiple interactive components, and a number of external links. I vendored every library that I used, and all assets, so nothing is being fetched over the internet (so that I had no dependencies).</w:t>
+      </w:r>
+    </w:p>
+    <w:p xmlns:wp14="http://schemas.microsoft.com/office/word/2010/wordml" wp14:textId="77777777">
+      <w:pPr>
+        <w:pStyle w:val="Normal"/>
+        <w:rPr/>
+      </w:pPr>
+      <w:r>
+        <w:rPr/>
+        <w:t>A much more extensive documentation that I used for my own benefit throughout the project can be found in the celestial-main/web-src/nts directory.</w:t>
+      </w:r>
+    </w:p>
+    <w:p xmlns:wp14="http://schemas.microsoft.com/office/word/2010/wordml" wp14:textId="77777777">
+      <w:pPr>
+        <w:pStyle w:val="Normal"/>
+        <w:rPr/>
       </w:pPr>
       <w:r>
         <w:rPr/>
         <w:t xml:space="preserve"> </w:t>
       </w:r>
     </w:p>
-    <w:p xmlns:wp14="http://schemas.microsoft.com/office/word/2010/wordml" wp14:paraId="113E1ED5" wp14:textId="467CD28A">
-      <w:pPr>
-        <w:pStyle w:val="Normal"/>
+    <w:p xmlns:wp14="http://schemas.microsoft.com/office/word/2010/wordml" wp14:textId="77777777">
+      <w:pPr>
+        <w:pStyle w:val="Normal"/>
+        <w:rPr/>
       </w:pPr>
       <w:r>
         <w:rPr/>
         <w:t>Shayam Suhansa:</w:t>
       </w:r>
     </w:p>
-    <w:p xmlns:wp14="http://schemas.microsoft.com/office/word/2010/wordml" wp14:paraId="1F4207C3" wp14:textId="0A654F49">
-      <w:pPr>
-        <w:pStyle w:val="Normal"/>
-      </w:pPr>
-      <w:r>
-        <w:rPr/>
-        <w:t>Full author of the landing page, and responsible for the hyperlinks, connecting everyone's pages together.</w:t>
-      </w:r>
+    <w:p xmlns:wp14="http://schemas.microsoft.com/office/word/2010/wordml" wp14:textId="77777777">
+      <w:pPr>
+        <w:pStyle w:val="Normal"/>
+        <w:rPr/>
+      </w:pPr>
+      <w:r>
+        <w:rPr/>
+        <w:t xml:space="preserve">Full author of the landing page, and responsible for the hyperlinks, connecting everyone's pages together. And responsible for constructing the project directory. </w:t>
+      </w:r>
+    </w:p>
+    <w:p xmlns:wp14="http://schemas.microsoft.com/office/word/2010/wordml" wp14:textId="77777777">
+      <w:pPr>
+        <w:pStyle w:val="Normal"/>
+        <w:rPr/>
+      </w:pPr>
+      <w:r>
+        <w:rPr/>
+        <w:t>Some of the libraries that I used are: three.js, Bootstrap and the Google font API</w:t>
+      </w:r>
+    </w:p>
+    <w:p xmlns:wp14="http://schemas.microsoft.com/office/word/2010/wordml" wp14:textId="77777777">
+      <w:pPr>
+        <w:pStyle w:val="Normal"/>
+        <w:rPr/>
+      </w:pPr>
+      <w:r>
+        <w:rPr/>
+        <w:t>A very detailed documentation is in my directory, /Shay/web-src/Webpage Documentation.docx</w:t>
+      </w:r>
+    </w:p>
+    <w:p xmlns:wp14="http://schemas.microsoft.com/office/word/2010/wordml" wp14:textId="77777777">
+      <w:pPr>
+        <w:pStyle w:val="Normal"/>
+        <w:rPr/>
+      </w:pPr>
       <w:r>
         <w:rPr/>
         <w:t xml:space="preserve"> </w:t>
       </w:r>
-      <w:r>
-        <w:rPr/>
-        <w:t xml:space="preserve">And </w:t>
-      </w:r>
-      <w:r>
-        <w:rPr/>
-        <w:t xml:space="preserve">responsible for constructing the </w:t>
-      </w:r>
-      <w:r>
-        <w:rPr/>
-        <w:t xml:space="preserve">project directory. </w:t>
-      </w:r>
-    </w:p>
-    <w:p xmlns:wp14="http://schemas.microsoft.com/office/word/2010/wordml" wp14:paraId="1F50860C" wp14:textId="66023B5B">
-      <w:pPr>
-        <w:pStyle w:val="Normal"/>
-      </w:pPr>
-      <w:r>
-        <w:rPr/>
-        <w:t>Some of the libraries that I used are: three.js, Bootstrap</w:t>
-      </w:r>
-      <w:r>
-        <w:rPr/>
-        <w:t xml:space="preserve"> and the </w:t>
-      </w:r>
-      <w:r>
-        <w:rPr/>
-        <w:t xml:space="preserve">Google font </w:t>
-      </w:r>
-      <w:r>
-        <w:rPr/>
-        <w:t>API</w:t>
-      </w:r>
-    </w:p>
-    <w:p xmlns:wp14="http://schemas.microsoft.com/office/word/2010/wordml" wp14:paraId="2C272B12" wp14:textId="6D7E09FC">
-      <w:pPr>
-        <w:pStyle w:val="Normal"/>
-      </w:pPr>
-      <w:r>
-        <w:rPr/>
-        <w:t>A very detailed</w:t>
-      </w:r>
-      <w:r>
-        <w:rPr/>
-        <w:t xml:space="preserve"> documentation is in my directory, /Shay/web-src/Webpage Documentation.docx</w:t>
-      </w:r>
-    </w:p>
-    <w:p xmlns:wp14="http://schemas.microsoft.com/office/word/2010/wordml" wp14:paraId="63841AB1" wp14:textId="2590C71D">
-      <w:pPr>
-        <w:pStyle w:val="Normal"/>
+    </w:p>
+    <w:p xmlns:wp14="http://schemas.microsoft.com/office/word/2010/wordml" wp14:textId="77777777">
+      <w:pPr>
+        <w:pStyle w:val="Normal"/>
+        <w:rPr/>
+      </w:pPr>
+      <w:r>
+        <w:rPr/>
+        <w:t>Lavyansh Rathod:</w:t>
+      </w:r>
+    </w:p>
+    <w:p xmlns:wp14="http://schemas.microsoft.com/office/word/2010/wordml" wp14:textId="77777777">
+      <w:pPr>
+        <w:pStyle w:val="Normal"/>
+        <w:rPr/>
       </w:pPr>
       <w:r>
         <w:rPr/>
         <w:t xml:space="preserve"> </w:t>
       </w:r>
-    </w:p>
-    <w:p xmlns:wp14="http://schemas.microsoft.com/office/word/2010/wordml" wp14:paraId="4BF48E2F" wp14:textId="615442D9">
-      <w:pPr>
-        <w:pStyle w:val="Normal"/>
-      </w:pPr>
-      <w:r>
-        <w:rPr/>
-        <w:t>Lavyansh Rathod:</w:t>
-      </w:r>
-    </w:p>
-    <w:p xmlns:wp14="http://schemas.microsoft.com/office/word/2010/wordml" wp14:paraId="45785555" wp14:textId="7007A8C6">
-      <w:pPr>
-        <w:pStyle w:val="Normal"/>
+      <w:r>
+        <w:rPr/>
+        <w:t>Full author of the Gustav Holst page, site has a button back to the landing page, and also an option to play background music, also wikipedia links to Gustav Holst, and multiple audio buttons to play songs at the bottom of the page.</w:t>
+      </w:r>
+    </w:p>
+    <w:p xmlns:wp14="http://schemas.microsoft.com/office/word/2010/wordml" wp14:textId="77777777">
+      <w:pPr>
+        <w:pStyle w:val="Normal"/>
+        <w:rPr/>
       </w:pPr>
       <w:r>
         <w:rPr/>
         <w:t xml:space="preserve"> </w:t>
       </w:r>
-      <w:r>
-        <w:rPr/>
-        <w:t xml:space="preserve">Full author of the Gustav Holst page, site has a button back to the landing page, </w:t>
-      </w:r>
-      <w:r>
-        <w:rPr/>
-        <w:t>and also</w:t>
-      </w:r>
-      <w:r>
-        <w:rPr/>
-        <w:t xml:space="preserve"> </w:t>
-      </w:r>
-      <w:r>
-        <w:rPr/>
-        <w:t>an option</w:t>
-      </w:r>
-      <w:r>
-        <w:rPr/>
-        <w:t xml:space="preserve"> to play background music, also </w:t>
-      </w:r>
-      <w:r>
-        <w:rPr/>
-        <w:t>wikipedia</w:t>
-      </w:r>
-      <w:r>
-        <w:rPr/>
-        <w:t xml:space="preserve"> links to </w:t>
-      </w:r>
-      <w:r>
-        <w:rPr/>
-        <w:t>Gustav Holst, and multiple audio buttons to play songs at the bottom of the page.</w:t>
-      </w:r>
-    </w:p>
-    <w:p xmlns:wp14="http://schemas.microsoft.com/office/word/2010/wordml" wp14:paraId="761C8FDC" wp14:textId="38CC7492">
-      <w:pPr>
-        <w:pStyle w:val="Normal"/>
-      </w:pPr>
-      <w:r>
-        <w:rPr/>
-        <w:t xml:space="preserve"> </w:t>
-      </w:r>
-    </w:p>
-    <w:p xmlns:wp14="http://schemas.microsoft.com/office/word/2010/wordml" wp14:paraId="0357C1BA" wp14:textId="585C4943">
-      <w:pPr>
-        <w:pStyle w:val="Normal"/>
-      </w:pPr>
-    </w:p>
-    <w:p xmlns:wp14="http://schemas.microsoft.com/office/word/2010/wordml" wp14:paraId="645ED192" wp14:textId="08C35D66">
-      <w:pPr>
-        <w:pStyle w:val="Normal"/>
-      </w:pPr>
-    </w:p>
-    <w:p xmlns:wp14="http://schemas.microsoft.com/office/word/2010/wordml" wp14:paraId="3B4D3F0E" wp14:textId="6FC86DD0">
-      <w:pPr>
-        <w:pStyle w:val="Normal"/>
-      </w:pPr>
-    </w:p>
-    <w:p xmlns:wp14="http://schemas.microsoft.com/office/word/2010/wordml" wp14:paraId="742E395E" wp14:textId="7F8EC0E7">
-      <w:pPr>
-        <w:pStyle w:val="Normal"/>
-      </w:pPr>
-    </w:p>
-    <w:p xmlns:wp14="http://schemas.microsoft.com/office/word/2010/wordml" wp14:paraId="2C078E63" wp14:textId="379DDCC0">
+    </w:p>
+    <w:p xmlns:wp14="http://schemas.microsoft.com/office/word/2010/wordml" wp14:textId="77777777">
+      <w:pPr>
+        <w:pStyle w:val="Normal"/>
+        <w:rPr/>
+      </w:pPr>
+      <w:r>
+        <w:rPr/>
+      </w:r>
+    </w:p>
+    <w:p xmlns:wp14="http://schemas.microsoft.com/office/word/2010/wordml" wp14:textId="77777777">
+      <w:pPr>
+        <w:pStyle w:val="Normal"/>
+        <w:rPr/>
+      </w:pPr>
+      <w:r>
+        <w:rPr/>
+      </w:r>
+    </w:p>
+    <w:p xmlns:wp14="http://schemas.microsoft.com/office/word/2010/wordml" wp14:textId="77777777">
+      <w:pPr>
+        <w:pStyle w:val="Normal"/>
+        <w:rPr/>
+      </w:pPr>
+      <w:r>
+        <w:rPr/>
+      </w:r>
+    </w:p>
+    <w:p xmlns:wp14="http://schemas.microsoft.com/office/word/2010/wordml" wp14:textId="77777777">
+      <w:pPr>
+        <w:pStyle w:val="Normal"/>
+        <w:rPr/>
+      </w:pPr>
+      <w:r>
+        <w:rPr/>
+      </w:r>
+    </w:p>
+    <w:p xmlns:wp14="http://schemas.microsoft.com/office/word/2010/wordml" wp14:textId="5F914AC9">
       <w:pPr>
         <w:pStyle w:val="Normal"/>
       </w:pPr>
       <w:r>
         <w:drawing>
-          <wp:inline xmlns:wp14="http://schemas.microsoft.com/office/word/2010/wordprocessingDrawing" wp14:editId="334C5733" wp14:anchorId="572BA933">
-            <wp:extent cx="6457950" cy="4294951"/>
+          <wp:inline xmlns:wp14="http://schemas.microsoft.com/office/word/2010/wordprocessingDrawing" wp14:editId="02944F06" wp14:anchorId="53504056">
+            <wp:extent cx="6457950" cy="4294505"/>
             <wp:effectExtent l="0" t="0" r="0" b="0"/>
-            <wp:docPr id="1036393859" name="drawing"/>
+            <wp:docPr id="1" name="drawing"/>
             <wp:cNvGraphicFramePr>
               <a:graphicFrameLocks noChangeAspect="1"/>
             </wp:cNvGraphicFramePr>
@@ -339,29 +247,26 @@
               <a:graphicData xmlns:a="http://schemas.openxmlformats.org/drawingml/2006/main" uri="http://schemas.openxmlformats.org/drawingml/2006/picture">
                 <pic:pic xmlns:pic="http://schemas.openxmlformats.org/drawingml/2006/picture">
                   <pic:nvPicPr>
-                    <pic:cNvPr id="1036393859" name="Picture 1036393859"/>
-                    <pic:cNvPicPr/>
+                    <pic:cNvPr id="1" name="drawing"/>
+                    <pic:cNvPicPr>
+                      <a:picLocks noChangeAspect="1" noChangeArrowheads="1"/>
+                    </pic:cNvPicPr>
                   </pic:nvPicPr>
                   <pic:blipFill>
-                    <a:blip xmlns:r="http://schemas.openxmlformats.org/officeDocument/2006/relationships" r:embed="rId1143809179">
-                      <a:extLst>
-                        <a:ext uri="{28A0092B-C50C-407E-A947-70E740481C1C}">
-                          <a14:useLocalDpi xmlns:a14="http://schemas.microsoft.com/office/drawing/2010/main"/>
-                        </a:ext>
-                      </a:extLst>
-                    </a:blip>
+                    <a:blip xmlns:r="http://schemas.openxmlformats.org/officeDocument/2006/relationships" r:embed="rId3"/>
                     <a:stretch>
                       <a:fillRect/>
                     </a:stretch>
                   </pic:blipFill>
-                  <pic:spPr>
-                    <a:xfrm rot="0">
+                  <pic:spPr bwMode="auto">
+                    <a:xfrm>
                       <a:off x="0" y="0"/>
-                      <a:ext cx="6457950" cy="4294951"/>
+                      <a:ext cx="6457950" cy="4294505"/>
                     </a:xfrm>
                     <a:prstGeom prst="rect">
                       <a:avLst/>
                     </a:prstGeom>
+                    <a:noFill/>
                   </pic:spPr>
                 </pic:pic>
               </a:graphicData>
@@ -369,12 +274,17 @@
           </wp:inline>
         </w:drawing>
       </w:r>
+    </w:p>
+    <w:p xmlns:wp14="http://schemas.microsoft.com/office/word/2010/wordml" wp14:textId="5F8B676E">
+      <w:pPr>
+        <w:pStyle w:val="Normal"/>
+      </w:pPr>
       <w:r>
         <w:drawing>
-          <wp:inline xmlns:wp14="http://schemas.microsoft.com/office/word/2010/wordprocessingDrawing" wp14:editId="1C8BC0FD" wp14:anchorId="533C5A90">
+          <wp:inline xmlns:wp14="http://schemas.microsoft.com/office/word/2010/wordprocessingDrawing" wp14:editId="4E4B8594" wp14:anchorId="41C70199">
             <wp:extent cx="5943600" cy="3952875"/>
             <wp:effectExtent l="0" t="0" r="0" b="0"/>
-            <wp:docPr id="838905100" name="drawing"/>
+            <wp:docPr id="2" name="Image2"/>
             <wp:cNvGraphicFramePr>
               <a:graphicFrameLocks noChangeAspect="1"/>
             </wp:cNvGraphicFramePr>
@@ -382,11 +292,51 @@
               <a:graphicData xmlns:a="http://schemas.openxmlformats.org/drawingml/2006/main" uri="http://schemas.openxmlformats.org/drawingml/2006/picture">
                 <pic:pic xmlns:pic="http://schemas.openxmlformats.org/drawingml/2006/picture">
                   <pic:nvPicPr>
-                    <pic:cNvPr id="838905100" name="Picture 838905100"/>
+                    <pic:cNvPr id="2" name="Image2"/>
+                    <pic:cNvPicPr>
+                      <a:picLocks noChangeAspect="1" noChangeArrowheads="1"/>
+                    </pic:cNvPicPr>
+                  </pic:nvPicPr>
+                  <pic:blipFill>
+                    <a:blip xmlns:r="http://schemas.openxmlformats.org/officeDocument/2006/relationships" r:embed="rId4"/>
+                    <a:stretch>
+                      <a:fillRect/>
+                    </a:stretch>
+                  </pic:blipFill>
+                  <pic:spPr bwMode="auto">
+                    <a:xfrm>
+                      <a:off x="0" y="0"/>
+                      <a:ext cx="5943600" cy="3952875"/>
+                    </a:xfrm>
+                    <a:prstGeom prst="rect">
+                      <a:avLst/>
+                    </a:prstGeom>
+                    <a:noFill/>
+                  </pic:spPr>
+                </pic:pic>
+              </a:graphicData>
+            </a:graphic>
+          </wp:inline>
+        </w:drawing>
+      </w:r>
+      <w:r>
+        <w:drawing>
+          <wp:inline xmlns:wp14="http://schemas.microsoft.com/office/word/2010/wordprocessingDrawing" wp14:editId="6C819365" wp14:anchorId="1735DF30">
+            <wp:extent cx="5943600" cy="3943350"/>
+            <wp:effectExtent l="0" t="0" r="0" b="0"/>
+            <wp:docPr id="373069767" name="drawing"/>
+            <wp:cNvGraphicFramePr>
+              <a:graphicFrameLocks noChangeAspect="1"/>
+            </wp:cNvGraphicFramePr>
+            <a:graphic>
+              <a:graphicData xmlns:a="http://schemas.openxmlformats.org/drawingml/2006/main" uri="http://schemas.openxmlformats.org/drawingml/2006/picture">
+                <pic:pic xmlns:pic="http://schemas.openxmlformats.org/drawingml/2006/picture">
+                  <pic:nvPicPr>
+                    <pic:cNvPr id="373069767" name="Picture 373069767"/>
                     <pic:cNvPicPr/>
                   </pic:nvPicPr>
                   <pic:blipFill>
-                    <a:blip xmlns:r="http://schemas.openxmlformats.org/officeDocument/2006/relationships" r:embed="rId974744010">
+                    <a:blip xmlns:r="http://schemas.openxmlformats.org/officeDocument/2006/relationships" r:embed="rId1738492871">
                       <a:extLst>
                         <a:ext uri="{28A0092B-C50C-407E-A947-70E740481C1C}">
                           <a14:useLocalDpi xmlns:a14="http://schemas.microsoft.com/office/drawing/2010/main"/>
@@ -400,7 +350,7 @@
                   <pic:spPr>
                     <a:xfrm>
                       <a:off x="0" y="0"/>
-                      <a:ext cx="5943600" cy="3952875"/>
+                      <a:ext cx="5943600" cy="3943350"/>
                     </a:xfrm>
                     <a:prstGeom prst="rect">
                       <a:avLst/>
@@ -412,134 +362,124 @@
           </wp:inline>
         </w:drawing>
       </w:r>
-      <w:r>
-        <w:drawing>
-          <wp:inline xmlns:wp14="http://schemas.microsoft.com/office/word/2010/wordprocessingDrawing" wp14:editId="65F0A6B7" wp14:anchorId="4012A6C5">
-            <wp:extent cx="5943600" cy="4000500"/>
-            <wp:effectExtent l="0" t="0" r="0" b="0"/>
-            <wp:docPr id="1044893733" name="drawing"/>
-            <wp:cNvGraphicFramePr>
-              <a:graphicFrameLocks noChangeAspect="1"/>
-            </wp:cNvGraphicFramePr>
-            <a:graphic>
-              <a:graphicData xmlns:a="http://schemas.openxmlformats.org/drawingml/2006/main" uri="http://schemas.openxmlformats.org/drawingml/2006/picture">
-                <pic:pic xmlns:pic="http://schemas.openxmlformats.org/drawingml/2006/picture">
-                  <pic:nvPicPr>
-                    <pic:cNvPr id="1044893733" name="Picture 1044893733"/>
-                    <pic:cNvPicPr/>
-                  </pic:nvPicPr>
-                  <pic:blipFill>
-                    <a:blip xmlns:r="http://schemas.openxmlformats.org/officeDocument/2006/relationships" r:embed="rId1973860939">
-                      <a:extLst>
-                        <a:ext uri="{28A0092B-C50C-407E-A947-70E740481C1C}">
-                          <a14:useLocalDpi xmlns:a14="http://schemas.microsoft.com/office/drawing/2010/main"/>
-                        </a:ext>
-                      </a:extLst>
-                    </a:blip>
-                    <a:stretch>
-                      <a:fillRect/>
-                    </a:stretch>
-                  </pic:blipFill>
-                  <pic:spPr>
-                    <a:xfrm>
-                      <a:off x="0" y="0"/>
-                      <a:ext cx="5943600" cy="4000500"/>
-                    </a:xfrm>
-                    <a:prstGeom prst="rect">
-                      <a:avLst/>
-                    </a:prstGeom>
-                  </pic:spPr>
-                </pic:pic>
-              </a:graphicData>
-            </a:graphic>
-          </wp:inline>
-        </w:drawing>
-      </w:r>
-    </w:p>
-    <w:p>
-      <w:pPr>
-        <w:pStyle w:val="Normal"/>
-      </w:pPr>
-    </w:p>
-    <w:p>
-      <w:pPr>
-        <w:pStyle w:val="Normal"/>
+    </w:p>
+    <w:p xmlns:wp14="http://schemas.microsoft.com/office/word/2010/wordml" wp14:textId="77777777">
+      <w:pPr>
+        <w:pStyle w:val="Normal"/>
+        <w:rPr/>
+      </w:pPr>
+      <w:r>
+        <w:rPr/>
+      </w:r>
+    </w:p>
+    <w:p xmlns:wp14="http://schemas.microsoft.com/office/word/2010/wordml" wp14:textId="77777777">
+      <w:pPr>
+        <w:pStyle w:val="Normal"/>
+        <w:rPr/>
       </w:pPr>
       <w:r>
         <w:rPr/>
         <w:t>AI transparency statements per group member:</w:t>
       </w:r>
     </w:p>
-    <w:p>
-      <w:pPr>
-        <w:pStyle w:val="Normal"/>
-      </w:pPr>
-    </w:p>
-    <w:p>
-      <w:pPr>
-        <w:pStyle w:val="Normal"/>
+    <w:p xmlns:wp14="http://schemas.microsoft.com/office/word/2010/wordml" wp14:textId="77777777">
+      <w:pPr>
+        <w:pStyle w:val="Normal"/>
+        <w:rPr/>
+      </w:pPr>
+      <w:r>
+        <w:rPr/>
+      </w:r>
+    </w:p>
+    <w:p xmlns:wp14="http://schemas.microsoft.com/office/word/2010/wordml" wp14:textId="77777777">
+      <w:pPr>
+        <w:pStyle w:val="Normal"/>
+        <w:rPr/>
       </w:pPr>
       <w:r>
         <w:rPr/>
         <w:t>Iso Safi:</w:t>
       </w:r>
     </w:p>
-    <w:p>
-      <w:pPr>
-        <w:pStyle w:val="Normal"/>
-      </w:pPr>
-      <w:r>
-        <w:rPr/>
-        <w:t xml:space="preserve">LLMs were used for fetching descriptions of the astronomers on my stars page, and to also find information about exoplanets, like the </w:t>
-      </w:r>
-      <w:r>
-        <w:rPr/>
-        <w:t>Keplers</w:t>
-      </w:r>
-      <w:r>
-        <w:rPr/>
-        <w:t>, which are part of the Earth page.</w:t>
-      </w:r>
-    </w:p>
-    <w:p>
-      <w:pPr>
-        <w:pStyle w:val="Normal"/>
-      </w:pPr>
-    </w:p>
-    <w:p>
-      <w:pPr>
-        <w:pStyle w:val="Normal"/>
+    <w:p xmlns:wp14="http://schemas.microsoft.com/office/word/2010/wordml" wp14:textId="77777777">
+      <w:pPr>
+        <w:pStyle w:val="Normal"/>
+        <w:rPr/>
+      </w:pPr>
+      <w:r>
+        <w:rPr/>
+        <w:t>LLMs were used for fetching descriptions of the astronomers on my stars page, and to also find information about exoplanets, like the Keplers, which are part of the Earth page.</w:t>
+      </w:r>
+    </w:p>
+    <w:p xmlns:wp14="http://schemas.microsoft.com/office/word/2010/wordml" wp14:textId="77777777">
+      <w:pPr>
+        <w:pStyle w:val="Normal"/>
+        <w:rPr/>
+      </w:pPr>
+      <w:r>
+        <w:rPr/>
+      </w:r>
+    </w:p>
+    <w:p xmlns:wp14="http://schemas.microsoft.com/office/word/2010/wordml" wp14:textId="77777777">
+      <w:pPr>
+        <w:pStyle w:val="Normal"/>
+        <w:rPr/>
       </w:pPr>
       <w:r>
         <w:rPr/>
         <w:t>Shayam:</w:t>
       </w:r>
     </w:p>
-    <w:p>
-      <w:pPr>
-        <w:pStyle w:val="Normal"/>
+    <w:p xmlns:wp14="http://schemas.microsoft.com/office/word/2010/wordml" wp14:textId="77777777">
+      <w:pPr>
+        <w:pStyle w:val="Normal"/>
+        <w:rPr/>
+      </w:pPr>
+      <w:r>
+        <w:rPr/>
+        <w:t>AI was used for research and for facts, the rest of the codebase has been followed by YouTube tutorials mostly.</w:t>
+      </w:r>
+    </w:p>
+    <w:p xmlns:wp14="http://schemas.microsoft.com/office/word/2010/wordml" wp14:textId="77777777">
+      <w:pPr>
+        <w:pStyle w:val="Normal"/>
+        <w:rPr/>
       </w:pPr>
       <w:r>
         <w:rPr/>
         <w:t>Lavyansh:</w:t>
       </w:r>
     </w:p>
+    <w:p xmlns:wp14="http://schemas.microsoft.com/office/word/2010/wordml" wp14:textId="56E6EF1D">
+      <w:pPr>
+        <w:pStyle w:val="Normal"/>
+        <w:spacing w:before="0" w:after="160"/>
+      </w:pPr>
+      <w:r>
+        <w:rPr/>
+        <w:t>I used AI for finding information about Gustav Holst and also for debugging</w:t>
+      </w:r>
+    </w:p>
     <w:sectPr>
+      <w:type w:val="nextPage"/>
       <w:pgSz w:w="12240" w:h="15840" w:orient="portrait"/>
-      <w:pgMar w:top="1440" w:right="1440" w:bottom="1440" w:left="1440" w:header="720" w:footer="720" w:gutter="0"/>
-      <w:cols w:space="720"/>
-      <w:docGrid w:linePitch="360"/>
+      <w:pgMar w:top="1440" w:right="1440" w:bottom="1440" w:left="1440" w:header="0" w:footer="0" w:gutter="0"/>
+      <w:pgNumType w:fmt="decimal"/>
+      <w:formProt w:val="false"/>
+      <w:textDirection w:val="lrTb"/>
+      <w:docGrid w:type="default" w:linePitch="360" w:charSpace="0"/>
+      <w:cols w:num="1"/>
     </w:sectPr>
   </w:body>
 </w:document>
 </file>
 
 <file path=word/styles.xml><?xml version="1.0" encoding="utf-8"?>
-<w:styles xmlns:wp14="http://schemas.microsoft.com/office/word/2010/wordprocessingDrawing" xmlns:mc="http://schemas.openxmlformats.org/markup-compatibility/2006" xmlns:r="http://schemas.openxmlformats.org/officeDocument/2006/relationships" xmlns:w="http://schemas.openxmlformats.org/wordprocessingml/2006/main" xmlns:w14="http://schemas.microsoft.com/office/word/2010/wordml" xmlns:w15="http://schemas.microsoft.com/office/word/2012/wordml" xmlns:w16se="http://schemas.microsoft.com/office/word/2015/wordml/symex" xmlns:w16cid="http://schemas.microsoft.com/office/word/2016/wordml/cid" xmlns:w16="http://schemas.microsoft.com/office/word/2018/wordml" xmlns:w16cex="http://schemas.microsoft.com/office/word/2018/wordml/cex" xmlns:w16sdtdh="http://schemas.microsoft.com/office/word/2020/wordml/sdtdatahash" xmlns:w16sdtfl="http://schemas.microsoft.com/office/word/2024/wordml/sdtformatlock" mc:Ignorable="w14 w15 wp14 w16se w16cid w16 w16cex w16sdtdh w16sdtfl">
+<w:styles xmlns:wp14="http://schemas.microsoft.com/office/word/2010/wordprocessingDrawing" xmlns:w="http://schemas.openxmlformats.org/wordprocessingml/2006/main" xmlns:w14="http://schemas.microsoft.com/office/word/2010/wordml" xmlns:mc="http://schemas.openxmlformats.org/markup-compatibility/2006" mc:Ignorable="w14 wp14">
   <w:docDefaults>
     <w:rPrDefault>
       <w:rPr>
-        <w:rFonts w:asciiTheme="minorHAnsi" w:hAnsiTheme="minorHAnsi" w:eastAsiaTheme="minorEastAsia" w:cstheme="minorBidi"/>
+        <w:rFonts w:ascii="Aptos" w:hAnsi="Aptos" w:eastAsia="" w:cs="" w:asciiTheme="minorHAnsi" w:hAnsiTheme="minorHAnsi" w:eastAsiaTheme="minorEastAsia" w:cstheme="minorBidi"/>
         <w:sz w:val="24"/>
         <w:szCs w:val="24"/>
         <w:lang w:val="en-US" w:eastAsia="ja-JP" w:bidi="ar-SA"/>
@@ -547,7 +487,7 @@
     </w:rPrDefault>
     <w:pPrDefault>
       <w:pPr>
-        <w:spacing w:after="160" w:line="279" w:lineRule="auto"/>
+        <w:suppressAutoHyphens w:val="true"/>
       </w:pPr>
     </w:pPrDefault>
   </w:docDefaults>
@@ -927,10 +867,93 @@
   <w:style w:type="paragraph" w:styleId="Normal" w:default="1">
     <w:name w:val="Normal"/>
     <w:qFormat/>
+    <w:pPr>
+      <w:widowControl/>
+      <w:bidi w:val="0"/>
+      <w:spacing w:before="0" w:after="160" w:line="278" w:lineRule="auto"/>
+      <w:jc w:val="start"/>
+    </w:pPr>
+    <w:rPr>
+      <w:rFonts w:ascii="Aptos" w:hAnsi="Aptos" w:eastAsia="" w:cs="" w:asciiTheme="minorHAnsi" w:hAnsiTheme="minorHAnsi" w:eastAsiaTheme="minorEastAsia" w:cstheme="minorBidi"/>
+      <w:color w:val="auto"/>
+      <w:kern w:val="0"/>
+      <w:sz w:val="24"/>
+      <w:szCs w:val="24"/>
+      <w:lang w:val="en-US" w:eastAsia="ja-JP" w:bidi="ar-SA"/>
+    </w:rPr>
   </w:style>
   <w:style w:type="character" w:styleId="DefaultParagraphFont" w:default="1">
     <w:name w:val="Default Paragraph Font"/>
     <w:uiPriority w:val="1"/>
+    <w:semiHidden/>
+    <w:unhideWhenUsed/>
+    <w:rPr/>
+  </w:style>
+  <w:style w:type="character" w:styleId="Hyperlink">
+    <w:name w:val="Hyperlink"/>
+    <w:rPr>
+      <w:color w:val="000080"/>
+      <w:u w:val="single"/>
+    </w:rPr>
+  </w:style>
+  <w:style w:type="paragraph" w:styleId="Heading">
+    <w:name w:val="Heading"/>
+    <w:basedOn w:val="Normal"/>
+    <w:next w:val="BodyText"/>
+    <w:pPr>
+      <w:keepNext w:val="true"/>
+      <w:spacing w:before="240" w:after="120"/>
+    </w:pPr>
+    <w:rPr>
+      <w:rFonts w:ascii="Liberation Sans" w:hAnsi="Liberation Sans" w:eastAsia="Noto Sans CJK SC" w:cs="Noto Sans"/>
+      <w:sz w:val="28"/>
+      <w:szCs w:val="28"/>
+    </w:rPr>
+  </w:style>
+  <w:style w:type="paragraph" w:styleId="BodyText">
+    <w:name w:val="Body Text"/>
+    <w:basedOn w:val="Normal"/>
+    <w:pPr>
+      <w:spacing w:before="0" w:after="140" w:line="276" w:lineRule="auto"/>
+    </w:pPr>
+    <w:rPr/>
+  </w:style>
+  <w:style w:type="paragraph" w:styleId="List">
+    <w:name w:val="List"/>
+    <w:basedOn w:val="BodyText"/>
+    <w:pPr/>
+    <w:rPr>
+      <w:rFonts w:cs="Noto Sans"/>
+    </w:rPr>
+  </w:style>
+  <w:style w:type="paragraph" w:styleId="Caption">
+    <w:name w:val="caption"/>
+    <w:basedOn w:val="Normal"/>
+    <w:pPr>
+      <w:suppressLineNumbers/>
+      <w:spacing w:before="120" w:after="120"/>
+    </w:pPr>
+    <w:rPr>
+      <w:rFonts w:cs="Noto Sans"/>
+      <w:i/>
+      <w:iCs/>
+      <w:sz w:val="24"/>
+      <w:szCs w:val="24"/>
+    </w:rPr>
+  </w:style>
+  <w:style w:type="paragraph" w:styleId="Index">
+    <w:name w:val="Index"/>
+    <w:basedOn w:val="Normal"/>
+    <w:pPr>
+      <w:suppressLineNumbers/>
+    </w:pPr>
+    <w:rPr>
+      <w:rFonts w:cs="Noto Sans"/>
+    </w:rPr>
+  </w:style>
+  <w:style w:type="numbering" w:styleId="NoList" w:default="1">
+    <w:name w:val="No List"/>
+    <w:uiPriority w:val="99"/>
     <w:semiHidden/>
     <w:unhideWhenUsed/>
   </w:style>
@@ -940,7 +963,6 @@
     <w:semiHidden/>
     <w:unhideWhenUsed/>
     <w:tblPr>
-      <w:tblInd w:w="0" w:type="dxa"/>
       <w:tblCellMar>
         <w:top w:w="0" w:type="dxa"/>
         <w:left w:w="108" w:type="dxa"/>
@@ -949,24 +971,18 @@
       </w:tblCellMar>
     </w:tblPr>
   </w:style>
-  <w:style w:type="numbering" w:styleId="NoList" w:default="1">
-    <w:name w:val="No List"/>
-    <w:uiPriority w:val="99"/>
-    <w:semiHidden/>
-    <w:unhideWhenUsed/>
-  </w:style>
 </w:styles>
 </file>
 
 <file path=word/theme/theme1.xml><?xml version="1.0" encoding="utf-8"?>
-<a:theme xmlns:thm15="http://schemas.microsoft.com/office/thememl/2012/main" xmlns:a="http://schemas.openxmlformats.org/drawingml/2006/main" name="Office Theme">
+<a:theme xmlns:a="http://schemas.openxmlformats.org/drawingml/2006/main" xmlns:r="http://schemas.openxmlformats.org/officeDocument/2006/relationships" name="Office Theme">
   <a:themeElements>
     <a:clrScheme name="Office">
       <a:dk1>
-        <a:sysClr val="windowText" lastClr="000000"/>
+        <a:srgbClr val="000000"/>
       </a:dk1>
       <a:lt1>
-        <a:sysClr val="window" lastClr="FFFFFF"/>
+        <a:srgbClr val="FFFFFF"/>
       </a:lt1>
       <a:dk2>
         <a:srgbClr val="0E2841"/>
@@ -1001,7 +1017,7 @@
     </a:clrScheme>
     <a:fontScheme name="Office">
       <a:majorFont>
-        <a:latin typeface="Aptos Display" panose="02110004020202020204"/>
+        <a:latin typeface="Aptos Display" panose="02110004020202020204" pitchFamily="0" charset="1"/>
         <a:ea typeface=""/>
         <a:cs typeface=""/>
         <a:font script="Jpan" typeface="ＭＳ ゴシック"/>
@@ -1036,7 +1052,7 @@
         <a:font script="Geor" typeface="Sylfaen"/>
       </a:majorFont>
       <a:minorFont>
-        <a:latin typeface="Aptos" panose="02110004020202020204"/>
+        <a:latin typeface="Aptos" panose="02110004020202020204" pitchFamily="0" charset="1"/>
         <a:ea typeface=""/>
         <a:cs typeface=""/>
         <a:font script="Jpan" typeface="ＭＳ 明朝"/>
@@ -1071,49 +1087,45 @@
         <a:font script="Geor" typeface="Sylfaen"/>
       </a:minorFont>
     </a:fontScheme>
-    <a:fmtScheme name="Office">
+    <a:fmtScheme>
       <a:fillStyleLst>
         <a:solidFill>
           <a:schemeClr val="phClr"/>
         </a:solidFill>
-        <a:gradFill rotWithShape="1">
+        <a:gradFill>
           <a:gsLst>
             <a:gs pos="0">
               <a:schemeClr val="phClr">
                 <a:lumMod val="110000"/>
-                <a:satMod val="105000"/>
                 <a:tint val="67000"/>
               </a:schemeClr>
             </a:gs>
             <a:gs pos="50000">
               <a:schemeClr val="phClr">
                 <a:lumMod val="105000"/>
-                <a:satMod val="103000"/>
                 <a:tint val="73000"/>
               </a:schemeClr>
             </a:gs>
             <a:gs pos="100000">
               <a:schemeClr val="phClr">
                 <a:lumMod val="105000"/>
-                <a:satMod val="109000"/>
                 <a:tint val="81000"/>
               </a:schemeClr>
             </a:gs>
           </a:gsLst>
           <a:lin ang="5400000" scaled="0"/>
+          <a:tileRect l="0" t="0" r="0" b="0"/>
         </a:gradFill>
-        <a:gradFill rotWithShape="1">
+        <a:gradFill>
           <a:gsLst>
             <a:gs pos="0">
               <a:schemeClr val="phClr">
-                <a:satMod val="103000"/>
                 <a:lumMod val="102000"/>
                 <a:tint val="94000"/>
               </a:schemeClr>
             </a:gs>
             <a:gs pos="50000">
               <a:schemeClr val="phClr">
-                <a:satMod val="110000"/>
                 <a:lumMod val="100000"/>
                 <a:shade val="100000"/>
               </a:schemeClr>
@@ -1121,33 +1133,24 @@
             <a:gs pos="100000">
               <a:schemeClr val="phClr">
                 <a:lumMod val="99000"/>
-                <a:satMod val="120000"/>
                 <a:shade val="78000"/>
               </a:schemeClr>
             </a:gs>
           </a:gsLst>
           <a:lin ang="5400000" scaled="0"/>
+          <a:tileRect l="0" t="0" r="0" b="0"/>
         </a:gradFill>
       </a:fillStyleLst>
       <a:lnStyleLst>
         <a:ln w="6350" cap="flat" cmpd="sng" algn="ctr">
-          <a:solidFill>
-            <a:schemeClr val="phClr"/>
-          </a:solidFill>
           <a:prstDash val="solid"/>
           <a:miter lim="800000"/>
         </a:ln>
         <a:ln w="12700" cap="flat" cmpd="sng" algn="ctr">
-          <a:solidFill>
-            <a:schemeClr val="phClr"/>
-          </a:solidFill>
           <a:prstDash val="solid"/>
           <a:miter lim="800000"/>
         </a:ln>
         <a:ln w="19050" cap="flat" cmpd="sng" algn="ctr">
-          <a:solidFill>
-            <a:schemeClr val="phClr"/>
-          </a:solidFill>
           <a:prstDash val="solid"/>
           <a:miter lim="800000"/>
         </a:ln>
@@ -1160,13 +1163,7 @@
           <a:effectLst/>
         </a:effectStyle>
         <a:effectStyle>
-          <a:effectLst>
-            <a:outerShdw blurRad="57150" dist="19050" dir="5400000" algn="ctr" rotWithShape="0">
-              <a:srgbClr val="000000">
-                <a:alpha val="63000"/>
-              </a:srgbClr>
-            </a:outerShdw>
-          </a:effectLst>
+          <a:effectLst/>
         </a:effectStyle>
       </a:effectStyleLst>
       <a:bgFillStyleLst>
@@ -1176,15 +1173,13 @@
         <a:solidFill>
           <a:schemeClr val="phClr">
             <a:tint val="95000"/>
-            <a:satMod val="170000"/>
           </a:schemeClr>
         </a:solidFill>
-        <a:gradFill rotWithShape="1">
+        <a:gradFill>
           <a:gsLst>
             <a:gs pos="0">
               <a:schemeClr val="phClr">
                 <a:tint val="93000"/>
-                <a:satMod val="150000"/>
                 <a:shade val="98000"/>
                 <a:lumMod val="102000"/>
               </a:schemeClr>
@@ -1192,7 +1187,6 @@
             <a:gs pos="50000">
               <a:schemeClr val="phClr">
                 <a:tint val="98000"/>
-                <a:satMod val="130000"/>
                 <a:shade val="90000"/>
                 <a:lumMod val="103000"/>
               </a:schemeClr>
@@ -1200,21 +1194,14 @@
             <a:gs pos="100000">
               <a:schemeClr val="phClr">
                 <a:shade val="63000"/>
-                <a:satMod val="120000"/>
               </a:schemeClr>
             </a:gs>
           </a:gsLst>
           <a:lin ang="5400000" scaled="0"/>
+          <a:tileRect l="0" t="0" r="0" b="0"/>
         </a:gradFill>
       </a:bgFillStyleLst>
     </a:fmtScheme>
   </a:themeElements>
-  <a:objectDefaults/>
-  <a:extraClrSchemeLst/>
-  <a:extLst>
-    <a:ext uri="{05A4C25C-085E-4340-85A3-A5531E510DB2}">
-      <thm15:themeFamily xmlns:thm15="http://schemas.microsoft.com/office/thememl/2012/main" name="Office Theme" id="{62F939B6-93AF-4DB8-9C6B-D6C7DFDC589F}" vid="{4A3C46E8-61CC-4603-A589-7422A47A8E4A}"/>
-    </a:ext>
-  </a:extLst>
 </a:theme>
 </file>
</xml_diff>

<commit_message>
added some instructions to the doc file
</commit_message>
<xml_diff>
--- a/to_submit.docx
+++ b/to_submit.docx
@@ -35,36 +35,187 @@
     <w:p xmlns:wp14="http://schemas.microsoft.com/office/word/2010/wordml" wp14:textId="77777777">
       <w:pPr>
         <w:pStyle w:val="Normal"/>
-        <w:rPr/>
-      </w:pPr>
-      <w:r>
-        <w:rPr>
-          <w:b/>
-          <w:bCs/>
+        <w:rPr>
+          <w:b w:val="1"/>
+          <w:bCs w:val="1"/>
+          <w:sz w:val="32"/>
+          <w:szCs w:val="32"/>
+        </w:rPr>
+      </w:pPr>
+      <w:r>
+        <w:rPr>
+          <w:b w:val="1"/>
+          <w:bCs w:val="1"/>
+          <w:sz w:val="32"/>
+          <w:szCs w:val="32"/>
+        </w:rPr>
+        <w:t>Iso Safi, Shayam Suhansa, Lavyansh Rathod</w:t>
+      </w:r>
+    </w:p>
+    <w:p xmlns:wp14="http://schemas.microsoft.com/office/word/2010/wordml" wp14:textId="29DD9F44">
+      <w:pPr>
+        <w:pStyle w:val="Normal"/>
+        <w:rPr>
+          <w:b w:val="0"/>
+          <w:bCs w:val="0"/>
+          <w:sz w:val="24"/>
+          <w:szCs w:val="24"/>
+        </w:rPr>
+      </w:pPr>
+      <w:r>
+        <w:rPr>
+          <w:b w:val="0"/>
+          <w:bCs w:val="0"/>
+          <w:sz w:val="24"/>
+          <w:szCs w:val="24"/>
+        </w:rPr>
+        <w:t>Usage:</w:t>
+      </w:r>
+    </w:p>
+    <w:p>
+      <w:pPr>
+        <w:pStyle w:val="Normal"/>
+        <w:rPr>
+          <w:b w:val="0"/>
+          <w:bCs w:val="0"/>
+          <w:sz w:val="24"/>
+          <w:szCs w:val="24"/>
+        </w:rPr>
+      </w:pPr>
+      <w:r>
+        <w:rPr>
+          <w:b w:val="0"/>
+          <w:bCs w:val="0"/>
+          <w:sz w:val="24"/>
+          <w:szCs w:val="24"/>
+        </w:rPr>
+        <w:t xml:space="preserve">The project can also be pulled from </w:t>
+      </w:r>
+      <w:r>
+        <w:rPr>
+          <w:b w:val="0"/>
+          <w:bCs w:val="0"/>
+          <w:sz w:val="24"/>
+          <w:szCs w:val="24"/>
+        </w:rPr>
+        <w:t>github</w:t>
+      </w:r>
+      <w:r>
+        <w:rPr>
+          <w:b w:val="0"/>
+          <w:bCs w:val="0"/>
+          <w:sz w:val="24"/>
+          <w:szCs w:val="24"/>
+        </w:rPr>
+        <w:t xml:space="preserve">(which I will keep up for a few weeks before </w:t>
+      </w:r>
+      <w:r>
+        <w:rPr>
+          <w:b w:val="0"/>
+          <w:bCs w:val="0"/>
+          <w:sz w:val="24"/>
+          <w:szCs w:val="24"/>
+        </w:rPr>
+        <w:t>privating</w:t>
+      </w:r>
+      <w:r>
+        <w:rPr>
+          <w:b w:val="0"/>
+          <w:bCs w:val="0"/>
+          <w:sz w:val="24"/>
+          <w:szCs w:val="24"/>
+        </w:rPr>
+        <w:t xml:space="preserve"> it) </w:t>
+      </w:r>
+      <w:r>
+        <w:rPr>
+          <w:b w:val="0"/>
+          <w:bCs w:val="0"/>
+          <w:sz w:val="24"/>
+          <w:szCs w:val="24"/>
+        </w:rPr>
+        <w:t>at :</w:t>
+      </w:r>
+      <w:r>
+        <w:rPr>
+          <w:b w:val="0"/>
+          <w:bCs w:val="0"/>
+          <w:sz w:val="24"/>
+          <w:szCs w:val="24"/>
+        </w:rPr>
+        <w:t xml:space="preserve"> </w:t>
+      </w:r>
+      <w:hyperlink r:id="R2c5897fc4cf34e2c">
+        <w:r>
+          <w:rPr>
+            <w:rStyle w:val="Hyperlink"/>
+            <w:b w:val="0"/>
+            <w:bCs w:val="0"/>
+            <w:sz w:val="24"/>
+            <w:szCs w:val="24"/>
+          </w:rPr>
+          <w:t>https://github.com/steeno17/celestial</w:t>
+        </w:r>
+      </w:hyperlink>
+      <w:r>
+        <w:br/>
+      </w:r>
+      <w:r>
+        <w:rPr>
+          <w:b w:val="0"/>
+          <w:bCs w:val="0"/>
+          <w:sz w:val="24"/>
+          <w:szCs w:val="24"/>
+        </w:rPr>
+        <w:t xml:space="preserve">simply pull the project and local host it with either a python or </w:t>
+      </w:r>
+      <w:r>
+        <w:rPr>
+          <w:b w:val="0"/>
+          <w:bCs w:val="0"/>
+          <w:sz w:val="24"/>
+          <w:szCs w:val="24"/>
+        </w:rPr>
+        <w:t>npx</w:t>
+      </w:r>
+      <w:r>
+        <w:rPr>
+          <w:b w:val="0"/>
+          <w:bCs w:val="0"/>
+          <w:sz w:val="24"/>
+          <w:szCs w:val="24"/>
+        </w:rPr>
+        <w:t xml:space="preserve"> http-server (navigate first to Shay/web-</w:t>
+      </w:r>
+      <w:r>
+        <w:rPr>
+          <w:b w:val="0"/>
+          <w:bCs w:val="0"/>
+          <w:sz w:val="24"/>
+          <w:szCs w:val="24"/>
+        </w:rPr>
+        <w:t>src</w:t>
+      </w:r>
+      <w:r>
+        <w:rPr>
+          <w:b w:val="0"/>
+          <w:bCs w:val="0"/>
+          <w:sz w:val="24"/>
+          <w:szCs w:val="24"/>
+        </w:rPr>
+        <w:t>/earth.html)</w:t>
+      </w:r>
+    </w:p>
+    <w:p>
+      <w:pPr>
+        <w:pStyle w:val="Normal"/>
+        <w:rPr>
+          <w:b w:val="1"/>
+          <w:bCs w:val="1"/>
           <w:sz w:val="28"/>
           <w:szCs w:val="28"/>
         </w:rPr>
-        <w:t>Iso Safi, Shayam Suhansa, Lavyansh Rathod</w:t>
-      </w:r>
-    </w:p>
-    <w:p xmlns:wp14="http://schemas.microsoft.com/office/word/2010/wordml" wp14:textId="77777777">
-      <w:pPr>
-        <w:pStyle w:val="Normal"/>
-        <w:rPr>
-          <w:b/>
-          <w:bCs/>
-          <w:sz w:val="28"/>
-          <w:szCs w:val="28"/>
-        </w:rPr>
-      </w:pPr>
-      <w:r>
-        <w:rPr>
-          <w:b/>
-          <w:bCs/>
-          <w:sz w:val="28"/>
-          <w:szCs w:val="28"/>
-        </w:rPr>
-      </w:r>
+      </w:pPr>
     </w:p>
     <w:p xmlns:wp14="http://schemas.microsoft.com/office/word/2010/wordml" wp14:textId="77777777">
       <w:pPr>
@@ -236,7 +387,7 @@
       </w:pPr>
       <w:r>
         <w:drawing>
-          <wp:inline xmlns:wp14="http://schemas.microsoft.com/office/word/2010/wordprocessingDrawing" wp14:editId="02944F06" wp14:anchorId="53504056">
+          <wp:inline xmlns:wp14="http://schemas.microsoft.com/office/word/2010/wordprocessingDrawing" wp14:editId="56C996D0" wp14:anchorId="53504056">
             <wp:extent cx="6457950" cy="4294505"/>
             <wp:effectExtent l="0" t="0" r="0" b="0"/>
             <wp:docPr id="1" name="drawing"/>
@@ -281,7 +432,7 @@
       </w:pPr>
       <w:r>
         <w:drawing>
-          <wp:inline xmlns:wp14="http://schemas.microsoft.com/office/word/2010/wordprocessingDrawing" wp14:editId="4E4B8594" wp14:anchorId="41C70199">
+          <wp:inline xmlns:wp14="http://schemas.microsoft.com/office/word/2010/wordprocessingDrawing" wp14:editId="35EB1038" wp14:anchorId="41C70199">
             <wp:extent cx="5943600" cy="3952875"/>
             <wp:effectExtent l="0" t="0" r="0" b="0"/>
             <wp:docPr id="2" name="Image2"/>
@@ -321,7 +472,7 @@
       </w:r>
       <w:r>
         <w:drawing>
-          <wp:inline xmlns:wp14="http://schemas.microsoft.com/office/word/2010/wordprocessingDrawing" wp14:editId="6C819365" wp14:anchorId="1735DF30">
+          <wp:inline xmlns:wp14="http://schemas.microsoft.com/office/word/2010/wordprocessingDrawing" wp14:editId="3DEB5144" wp14:anchorId="1735DF30">
             <wp:extent cx="5943600" cy="3943350"/>
             <wp:effectExtent l="0" t="0" r="0" b="0"/>
             <wp:docPr id="373069767" name="drawing"/>

</xml_diff>